<commit_message>
Update final Word report
with corrected fairness metrics
</commit_message>
<xml_diff>
--- a/reports/Final_Capstone_Report_Student_Attrition.docx
+++ b/reports/Final_Capstone_Report_Student_Attrition.docx
@@ -2871,7 +2871,7 @@
               <w:jc w:val="right"/>
             </w:pPr>
             <w:r>
-              <w:t xml:space="preserve">52.6%</w:t>
+              <w:t xml:space="preserve">51.4%</w:t>
             </w:r>
           </w:p>
         </w:tc>
@@ -2933,7 +2933,7 @@
               <w:jc w:val="right"/>
             </w:pPr>
             <w:r>
-              <w:t xml:space="preserve">58.9%</w:t>
+              <w:t xml:space="preserve">58.1%</w:t>
             </w:r>
           </w:p>
         </w:tc>

</xml_diff>